<commit_message>
docs: corrige as afirmações que não correspondiam às fontes
Reescreve quatro passagens do documento em que o texto atribuía às fontes
afirmações que elas não fazem, detectadas na conferência de cada citação em seu
contexto. A mais grave descrevia o estudo da UNIRIO como raspagem de dados da
internet, quando ele cruza a base acadêmica com a RAIS mediante convênio com o
Ministério da Economia.

Resolve também a entrada Cabral, cujo caso era inverso ao das demais: a autoria
estava correta e o endereço é que apontava para outro trabalho. Corrigidos o
título, os prenomes, o veículo e a URL, e acrescentado o fichamento da obra.

A conclusão de descartar as fontes secundárias não mudou; mudou a fundamentação,
que deixa de ser atribuída às fontes e passa a ser argumento do projeto.

Co-Authored-By: Claude Opus 5 <noreply@anthropic.com>
</commit_message>
<xml_diff>
--- a/docs/projeto/Projeto_de_Pesquisa_Egressos_IFSP.docx
+++ b/docs/projeto/Projeto_de_Pesquisa_Egressos_IFSP.docx
@@ -1863,7 +1863,21 @@
           <w:sz w:val="22"/>
           <w:szCs w:val="22"/>
         </w:rPr>
-        <w:t>Do ponto de vista do instrumento, Cabral, Silva e Pacheco (2016), em estudo conduzido para embasar o sistema da Universidade Federal de Uberlândia, criticaram os portais de egressos das principais universidades brasileiras, apontando a ausência de funcionalidades proativas e a redução dos sistemas a cadastros estáticos. Essa crítica sustenta a premissa de que o mecanismo de coleta deve ser ativo, e não apenas receptivo, o que justifica a centralidade atribuída neste projeto à rastreabilidade dos participantes e à automação do contato.</w:t>
+        <w:t xml:space="preserve">Do ponto de vista do instrumento, Cabral, Silva e Pacheco (2016), </w:t>
+      </w:r>
+      <w:r>
+        <w:rPr>
+          <w:sz w:val="22"/>
+          <w:szCs w:val="22"/>
+        </w:rPr>
+        <w:t>ao examinarem os portais de egressos das dez melhores universidades públicas brasileiras, apontaram a falta de atenção institucional a esses portais, a inexistência de páginas únicas e centralizadas e a redução dos sistemas a cadastros estáticos</w:t>
+      </w:r>
+      <w:r>
+        <w:rPr>
+          <w:sz w:val="22"/>
+          <w:szCs w:val="22"/>
+        </w:rPr>
+        <w:t>. Essa crítica sustenta a premissa de que o mecanismo de coleta deve ser ativo, e não apenas receptivo, o que justifica a centralidade atribuída neste projeto à rastreabilidade dos participantes e à automação do contato.</w:t>
       </w:r>
     </w:p>
     <w:p>
@@ -1911,7 +1925,49 @@
           <w:sz w:val="22"/>
           <w:szCs w:val="22"/>
         </w:rPr>
-        <w:t xml:space="preserve">No campo da automação da coleta, parte da literatura propõe a extração de dados públicos da internet. O relato de mapeamento automatizado da vida profissional de egressos de Sistemas de Informação da Universidade Federal do Estado do Rio de Janeiro demonstrou a pertinência dessa abordagem para cursos de tecnologia, cujos formados mantêm presença digital significativa (ALVARES; LOUTFI; CAMPOS, 2020). Pesquisas conduzidas na Universidade Federal de Ouro Preto e em ferramenta computacional desenvolvida na Universidade Paranaense demonstraram igualmente a viabilidade de mapear trajetórias profissionais por raspagem de dados e integração a currículos da Plataforma Lattes </w:t>
+        <w:t xml:space="preserve">No campo da automação da coleta, parte da literatura </w:t>
+      </w:r>
+      <w:r>
+        <w:rPr>
+          <w:sz w:val="22"/>
+          <w:szCs w:val="22"/>
+        </w:rPr>
+        <w:t>dispensa o contato com o egresso e recorre a fontes secundárias</w:t>
+      </w:r>
+      <w:r>
+        <w:rPr>
+          <w:sz w:val="22"/>
+          <w:szCs w:val="22"/>
+        </w:rPr>
+        <w:t xml:space="preserve">. O relato de mapeamento automatizado da vida profissional de egressos de Sistemas de Informação da Universidade Federal do Estado do Rio de Janeiro </w:t>
+      </w:r>
+      <w:r>
+        <w:rPr>
+          <w:sz w:val="22"/>
+          <w:szCs w:val="22"/>
+        </w:rPr>
+        <w:t>obteve indicadores de empregabilidade e remuneração pelo cruzamento da base acadêmica com a Relação Anual de Informações Sociais e com a base pública de CNPJ, mediante convênio com o Ministério da Economia</w:t>
+      </w:r>
+      <w:r>
+        <w:rPr>
+          <w:sz w:val="22"/>
+          <w:szCs w:val="22"/>
+        </w:rPr>
+        <w:t xml:space="preserve"> (ALVARES; LOUTFI; CAMPOS, 2020). Pesquisas conduzidas na Universidade Federal de Ouro Preto e em ferramenta computacional desenvolvida na Universidade Paranaense </w:t>
+      </w:r>
+      <w:r>
+        <w:rPr>
+          <w:sz w:val="22"/>
+          <w:szCs w:val="22"/>
+        </w:rPr>
+        <w:t>demonstraram, respectivamente, a extração de trajetórias a partir de perfis públicos do LinkedIn e a coleta automatizada de currículos da Plataforma Lattes</w:t>
+      </w:r>
+      <w:r>
+        <w:rPr>
+          <w:sz w:val="22"/>
+          <w:szCs w:val="22"/>
+        </w:rPr>
+        <w:t xml:space="preserve"> </w:t>
       </w:r>
       <w:r>
         <w:rPr>
@@ -1925,7 +1981,49 @@
           <w:sz w:val="22"/>
           <w:szCs w:val="22"/>
         </w:rPr>
-        <w:t>. Essas mesmas fontes registram, entretanto, que plataformas externas alteram com frequência sua estrutura de documento e aplicam proteções contra raspagem automatizada, o que obriga manutenção recorrente do código e eventual uso de serviços pagos. Considerando o horizonte temporal e os recursos deste projeto, tal abordagem foi deliberadamente excluída do escopo.</w:t>
+        <w:t xml:space="preserve">. </w:t>
+      </w:r>
+      <w:r>
+        <w:rPr>
+          <w:sz w:val="22"/>
+          <w:szCs w:val="22"/>
+        </w:rPr>
+        <w:t>Cada uma dessas vias esbarra, contudo, em restrição própria: o acesso nominal à RAIS depende de convênio cuja tramitação não é controlável pela equipe,</w:t>
+      </w:r>
+      <w:r>
+        <w:rPr>
+          <w:sz w:val="22"/>
+          <w:szCs w:val="22"/>
+        </w:rPr>
+        <w:t xml:space="preserve"> </w:t>
+      </w:r>
+      <w:r>
+        <w:rPr>
+          <w:sz w:val="22"/>
+          <w:szCs w:val="22"/>
+        </w:rPr>
+        <w:t>a extração de perfis em plataforma privada envolve seus termos de uso e o tratamento de dados de terceiros sem consentimento, e a consulta ao Lattes pressupõe currículo atualizado, hábito pouco frequente fora da pós-graduação.</w:t>
+      </w:r>
+      <w:r>
+        <w:rPr>
+          <w:sz w:val="22"/>
+          <w:szCs w:val="22"/>
+        </w:rPr>
+        <w:t xml:space="preserve"> Considerando o horizonte temporal e os recursos deste projeto, </w:t>
+      </w:r>
+      <w:r>
+        <w:rPr>
+          <w:sz w:val="22"/>
+          <w:szCs w:val="22"/>
+        </w:rPr>
+        <w:t>essas abordagens foram deliberadamente excluídas do escopo</w:t>
+      </w:r>
+      <w:r>
+        <w:rPr>
+          <w:sz w:val="22"/>
+          <w:szCs w:val="22"/>
+        </w:rPr>
+        <w:t>.</w:t>
       </w:r>
     </w:p>
     <w:p>
@@ -1938,7 +2036,21 @@
           <w:sz w:val="22"/>
           <w:szCs w:val="22"/>
         </w:rPr>
-        <w:t>De modo análogo, o cruzamento com bases governamentais de emprego formal, como praticado pela Universidade de Brasília mediante convênio para acesso à Relação Anual de Informações Sociais, produz indicadores de empregabilidade e remuneração de precisão superior à autodeclaração (UNB, 2019). Essa via, contudo, além de depender de convênio institucional cuja tramitação é incompatível com o cronograma proposto, apresenta limitação reconhecida de escopo, pois reflete exclusivamente o mercado formal regido pela Consolidação das Leis do Trabalho, omitindo profissionais autônomos, pessoas jurídicas, trabalhadores de plataformas digitais e egressos atuando no exterior. O instrumento declarado, ao contrário, é capaz de capturar precisamente essas categorias, o que reforça sua pertinência para um curso de tecnologia.</w:t>
+        <w:t xml:space="preserve">De modo análogo, o cruzamento com bases governamentais de emprego formal, como praticado pela Universidade de Brasília mediante convênio para acesso à Relação Anual de Informações Sociais, </w:t>
+      </w:r>
+      <w:r>
+        <w:rPr>
+          <w:sz w:val="22"/>
+          <w:szCs w:val="22"/>
+        </w:rPr>
+        <w:t>produz indicadores de empregabilidade e remuneração a partir de registro administrativo, embora capte somente vínculos formais de emprego</w:t>
+      </w:r>
+      <w:r>
+        <w:rPr>
+          <w:sz w:val="22"/>
+          <w:szCs w:val="22"/>
+        </w:rPr>
+        <w:t xml:space="preserve"> (UNB, 2019). Essa via, contudo, além de depender de convênio institucional cuja tramitação é incompatível com o cronograma proposto, apresenta limitação reconhecida de escopo, pois reflete exclusivamente o mercado formal regido pela Consolidação das Leis do Trabalho, omitindo profissionais autônomos, pessoas jurídicas, trabalhadores de plataformas digitais e egressos atuando no exterior. O instrumento declarado, ao contrário, é capaz de capturar precisamente essas categorias, o que reforça sua pertinência para um curso de tecnologia.</w:t>
       </w:r>
     </w:p>
     <w:p>
@@ -1951,21 +2063,28 @@
           <w:sz w:val="22"/>
           <w:szCs w:val="22"/>
         </w:rPr>
-        <w:t xml:space="preserve">Quanto à apropriação dos dados pela gestão, o projeto desenvolvido na Universidade Federal do Pampa concentrou-se na experiência dos coordenadores que despendem esforço elevado no rastreamento manual de egressos, e avaliou seu protótipo à luz dos vetores de utilidade percebida e facilidade de uso percebida propostos por Davis (1989), concluindo que a adoção do software depende decisivamente da clareza da interface gerencial </w:t>
-      </w:r>
-      <w:r>
-        <w:rPr>
-          <w:sz w:val="22"/>
-          <w:szCs w:val="22"/>
-        </w:rPr>
-        <w:t>(SILVA et al., 2024)</w:t>
-      </w:r>
-      <w:r>
-        <w:rPr>
-          <w:sz w:val="22"/>
-          <w:szCs w:val="22"/>
-        </w:rPr>
-        <w:t xml:space="preserve">. Já a plataforma desenvolvida no Centro Federal de Educação Tecnológica de Minas Gerais para a Rede de Educação Profissional e Tecnológica evidencia a tendência de adoção de premissas de código aberto em soluções públicas, favorecendo a continuidade e a sucessão técnica dos projetos </w:t>
+        <w:t xml:space="preserve">Quanto à apropriação dos dados pela gestão, o projeto desenvolvido na Universidade Federal do Pampa concentrou-se na experiência dos coordenadores que despendem esforço elevado no rastreamento manual de egressos, e avaliou seu protótipo à luz dos vetores de utilidade percebida e facilidade de uso percebida propostos </w:t>
+      </w:r>
+      <w:r>
+        <w:rPr>
+          <w:sz w:val="22"/>
+          <w:szCs w:val="22"/>
+        </w:rPr>
+        <w:t>por Davis (1989). Os sete coordenadores consultados concordaram que a ferramenta agilizaria</w:t>
+      </w:r>
+      <w:r>
+        <w:rPr>
+          <w:sz w:val="22"/>
+          <w:szCs w:val="22"/>
+        </w:rPr>
+        <w:t xml:space="preserve"> a elaboração dos instrumentos e a análise dos dados; a avaliação, contudo, incidiu sobre protótipo não funcional e afere intenção declarada de uso (SILVA et al., 2024).</w:t>
+      </w:r>
+      <w:r>
+        <w:rPr>
+          <w:sz w:val="22"/>
+          <w:szCs w:val="22"/>
+        </w:rPr>
+        <w:t xml:space="preserve"> Já a plataforma desenvolvida no Centro Federal de Educação Tecnológica de Minas Gerais para a Rede de Educação Profissional e Tecnológica evidencia a tendência de adoção de premissas de código aberto em soluções públicas, favorecendo a continuidade e a sucessão técnica dos projetos </w:t>
       </w:r>
       <w:r>
         <w:rPr>
@@ -4847,7 +4966,16 @@
         <w:spacing w:after="140" w:line="260" w:lineRule="auto"/>
       </w:pPr>
       <w:r>
-        <w:t>CABRAL, T.; SILVA, L.; PACHECO, R. Arquitetura frontend e interface de um sistema de acompanhamento de egressos. Uberlândia: Universidade Federal de Uberlândia, 2016. Disponível em: https://repositorio.ufu.br/bitstream/123456789/45437/1/ArquiteturaFrontendInterface.pdf. Acesso em: 30 maio 2026.</w:t>
+        <w:t>CABRAL, T. L. de O.; SILVA, F. C. da; PACHECO, A. S. V. As universidades e o relacionamento com seus ex-alunos: uma análise de portais online de egressos. Revista Gestão Universitária na América Latina - GUAL, Florianópolis, v. 9, n. 3, p. 157-173, 2016.</w:t>
+      </w:r>
+      <w:r>
+        <w:t xml:space="preserve"> Disponível em: </w:t>
+      </w:r>
+      <w:r>
+        <w:t>https://periodicos.ufsc.br/index.php/gual/article/view/45525</w:t>
+      </w:r>
+      <w:r>
+        <w:t>. Acesso em: 30 maio 2026.</w:t>
       </w:r>
     </w:p>
     <w:p>

</xml_diff>